<commit_message>
Team details, live URL, PS ownership; fix overlapping chart titles
- Group 8 · Matrix Mechanics, members and https://calibofraudguard.netlify.app/ in the deck, all Word documents, README, notebook, web app and Streamlit demo
- Problem-statement owners: PS1-2 N. Varshitha, PS3-4 M. Kumara Swamy, PS5-6 V. Naishadh, PS7-8 M. Suman Srinivas
- Deck: new team/ownership slide, presenter named on every slide, placeholders replaced, demo screenshots retaken (27 slides)
- Figures: super-titles moved above panel titles (fixes overlap on the fraud-by-amount/hour slide and six other charts); notebooks re-executed, every number unchanged
- README .docx: code blocks and table widths readable
</commit_message>
<xml_diff>
--- a/docs/FraudGuard_Business_Report.docx
+++ b/docs/FraudGuard_Business_Report.docx
@@ -28,10 +28,7 @@
     </w:p>
     <w:p>
       <w:pPr>
-        <w:pBdr>
-          <w:bottom w:val="single" w:color="D3D9E2" w:sz="6" w:space="6"/>
-        </w:pBdr>
-        <w:spacing w:after="240"/>
+        <w:spacing w:after="80"/>
       </w:pPr>
       <w:r>
         <w:rPr>
@@ -41,6 +38,75 @@
         </w:rPr>
         <w:t xml:space="preserve">Real-time payment fraud decisions: approve, step-up OTP or block, set by rupee cost · KLU + Path-3 · ML-02 · 31 October 2026</w:t>
       </w:r>
+    </w:p>
+    <w:p>
+      <w:pPr>
+        <w:spacing w:after="40"/>
+      </w:pPr>
+      <w:r>
+        <w:rPr>
+          <w:b/>
+          <w:bCs/>
+          <w:color w:val="14284B"/>
+          <w:sz w:val="20"/>
+          <w:szCs w:val="20"/>
+        </w:rPr>
+        <w:t xml:space="preserve">Group 8 · Matrix Mechanics</w:t>
+      </w:r>
+      <w:r>
+        <w:rPr>
+          <w:color w:val="1F2A3C"/>
+          <w:sz w:val="20"/>
+          <w:szCs w:val="20"/>
+        </w:rPr>
+        <w:t xml:space="preserve">  ·  N. Varshitha · M. Kumara Swamy · V. Naishadh · M. Suman Srinivas</w:t>
+      </w:r>
+    </w:p>
+    <w:p>
+      <w:pPr>
+        <w:pBdr>
+          <w:bottom w:val="single" w:color="D3D9E2" w:sz="6" w:space="6"/>
+        </w:pBdr>
+        <w:spacing w:after="240"/>
+      </w:pPr>
+      <w:r>
+        <w:rPr>
+          <w:color w:val="5B677A"/>
+          <w:sz w:val="18"/>
+          <w:szCs w:val="18"/>
+        </w:rPr>
+        <w:t xml:space="preserve">Live app: </w:t>
+      </w:r>
+      <w:hyperlink w:history="1" r:id="rIdp67ichr2ijnseovwezlmx">
+        <w:r>
+          <w:rPr>
+            <w:color w:val="2F6FEB"/>
+            <w:sz w:val="18"/>
+            <w:szCs w:val="18"/>
+            <w:u w:val="single"/>
+          </w:rPr>
+          <w:t xml:space="preserve">https://calibofraudguard.netlify.app/</w:t>
+        </w:r>
+      </w:hyperlink>
+      <w:r>
+        <w:rPr>
+          <w:color w:val="5B677A"/>
+          <w:sz w:val="18"/>
+          <w:szCs w:val="18"/>
+        </w:rPr>
+        <w:t xml:space="preserve">   ·   Code: </w:t>
+      </w:r>
+      <w:hyperlink w:history="1" r:id="rIdjmiywgtm7h8y0tab8azee">
+        <w:r>
+          <w:rPr>
+            <w:color w:val="2F6FEB"/>
+            <w:sz w:val="18"/>
+            <w:szCs w:val="18"/>
+            <w:u w:val="single"/>
+          </w:rPr>
+          <w:t xml:space="preserve">github.com/naishadhvytla/hackathon01calibo</w:t>
+        </w:r>
+      </w:hyperlink>
     </w:p>
     <w:p>
       <w:pPr>
@@ -2531,7 +2597,7 @@
       <w:r>
         <w:drawing>
           <wp:inline distT="0" distB="0" distL="0" distR="0">
-            <wp:extent cx="5848350" cy="2028825"/>
+            <wp:extent cx="5848350" cy="2362200"/>
             <wp:effectExtent t="0" r="0" b="0" l="0"/>
             <wp:docPr id="15" name="02_fraud_by_amount_hour.png" descr="02_fraud_by_amount_hour.png" title="02_fraud_by_amount_hour.png"/>
             <wp:cNvGraphicFramePr>
@@ -2556,7 +2622,7 @@
                   <pic:spPr bwMode="auto">
                     <a:xfrm>
                       <a:off x="0" y="0"/>
-                      <a:ext cx="5848350" cy="2028825"/>
+                      <a:ext cx="5848350" cy="2362200"/>
                     </a:xfrm>
                     <a:prstGeom prst="rect">
                       <a:avLst/>
@@ -2770,7 +2836,7 @@
       <w:r>
         <w:drawing>
           <wp:inline distT="0" distB="0" distL="0" distR="0">
-            <wp:extent cx="5667375" cy="3276600"/>
+            <wp:extent cx="5667375" cy="3429000"/>
             <wp:effectExtent t="0" r="0" b="0" l="0"/>
             <wp:docPr id="17" name="02_upi_fraud_rates.png" descr="02_upi_fraud_rates.png" title="02_upi_fraud_rates.png"/>
             <wp:cNvGraphicFramePr>
@@ -2795,7 +2861,7 @@
                   <pic:spPr bwMode="auto">
                     <a:xfrm>
                       <a:off x="0" y="0"/>
-                      <a:ext cx="5667375" cy="3276600"/>
+                      <a:ext cx="5667375" cy="3429000"/>
                     </a:xfrm>
                     <a:prstGeom prst="rect">
                       <a:avLst/>
@@ -4912,6 +4978,591 @@
         <w:t xml:space="preserve">Model Comparison and Cost Analysis &amp; Risk-Score Rule documents; presentation deck.</w:t>
       </w:r>
     </w:p>
+    <w:p>
+      <w:pPr>
+        <w:pStyle w:val="ListParagraph"/>
+        <w:numPr>
+          <w:ilvl w:val="0"/>
+          <w:numId w:val="2"/>
+        </w:numPr>
+        <w:spacing w:after="60" w:line="264"/>
+      </w:pPr>
+      <w:r>
+        <w:rPr>
+          <w:b/>
+          <w:bCs/>
+        </w:rPr>
+        <w:t xml:space="preserve">Live app:</w:t>
+      </w:r>
+      <w:r>
+        <w:t xml:space="preserve"> https://calibofraudguard.netlify.app/ (create an account, confirm the email, sign in; Credit Card and UPI modes).</w:t>
+      </w:r>
+    </w:p>
+    <w:p>
+      <w:pPr>
+        <w:pStyle w:val="Heading1"/>
+        <w:keepNext/>
+        <w:spacing w:after="120" w:before="280"/>
+      </w:pPr>
+      <w:r>
+        <w:t xml:space="preserve">13. Team and ownership</w:t>
+      </w:r>
+    </w:p>
+    <w:tbl>
+      <w:tblPr>
+        <w:tblW w:type="dxa" w:w="9314"/>
+        <w:tblBorders>
+          <w:top w:val="single" w:color="auto" w:sz="4"/>
+          <w:left w:val="single" w:color="auto" w:sz="4"/>
+          <w:bottom w:val="single" w:color="auto" w:sz="4"/>
+          <w:right w:val="single" w:color="auto" w:sz="4"/>
+          <w:insideH w:val="single" w:color="auto" w:sz="4"/>
+          <w:insideV w:val="single" w:color="auto" w:sz="4"/>
+        </w:tblBorders>
+        <w:tblLayout w:type="fixed"/>
+      </w:tblPr>
+      <w:tblGrid>
+        <w:gridCol w:w="1900"/>
+        <w:gridCol w:w="3907"/>
+        <w:gridCol w:w="3507"/>
+      </w:tblGrid>
+      <w:tr>
+        <w:trPr>
+          <w:tblHeader/>
+        </w:trPr>
+        <w:tc>
+          <w:tcPr>
+            <w:tcW w:type="dxa" w:w="1900"/>
+            <w:tcBorders>
+              <w:top w:val="single" w:color="D3D9E2" w:sz="4"/>
+              <w:left w:val="single" w:color="D3D9E2" w:sz="4"/>
+              <w:bottom w:val="single" w:color="D3D9E2" w:sz="4"/>
+              <w:right w:val="single" w:color="D3D9E2" w:sz="4"/>
+            </w:tcBorders>
+            <w:shd w:fill="14284B" w:color="auto" w:val="clear"/>
+            <w:tcMar>
+              <w:top w:type="dxa" w:w="50"/>
+              <w:left w:type="dxa" w:w="80"/>
+              <w:bottom w:type="dxa" w:w="50"/>
+              <w:right w:type="dxa" w:w="80"/>
+            </w:tcMar>
+          </w:tcPr>
+          <w:p>
+            <w:pPr>
+              <w:jc w:val="left"/>
+            </w:pPr>
+            <w:r>
+              <w:rPr>
+                <w:b/>
+                <w:bCs/>
+                <w:color w:val="FFFFFF"/>
+                <w:sz w:val="16"/>
+                <w:szCs w:val="16"/>
+              </w:rPr>
+              <w:t xml:space="preserve">Member</w:t>
+            </w:r>
+          </w:p>
+        </w:tc>
+        <w:tc>
+          <w:tcPr>
+            <w:tcW w:type="dxa" w:w="3907"/>
+            <w:tcBorders>
+              <w:top w:val="single" w:color="D3D9E2" w:sz="4"/>
+              <w:left w:val="single" w:color="D3D9E2" w:sz="4"/>
+              <w:bottom w:val="single" w:color="D3D9E2" w:sz="4"/>
+              <w:right w:val="single" w:color="D3D9E2" w:sz="4"/>
+            </w:tcBorders>
+            <w:shd w:fill="14284B" w:color="auto" w:val="clear"/>
+            <w:tcMar>
+              <w:top w:type="dxa" w:w="50"/>
+              <w:left w:type="dxa" w:w="80"/>
+              <w:bottom w:type="dxa" w:w="50"/>
+              <w:right w:type="dxa" w:w="80"/>
+            </w:tcMar>
+          </w:tcPr>
+          <w:p>
+            <w:pPr>
+              <w:jc w:val="left"/>
+            </w:pPr>
+            <w:r>
+              <w:rPr>
+                <w:b/>
+                <w:bCs/>
+                <w:color w:val="FFFFFF"/>
+                <w:sz w:val="16"/>
+                <w:szCs w:val="16"/>
+              </w:rPr>
+              <w:t xml:space="preserve">Problem statements</w:t>
+            </w:r>
+          </w:p>
+        </w:tc>
+        <w:tc>
+          <w:tcPr>
+            <w:tcW w:type="dxa" w:w="3507"/>
+            <w:tcBorders>
+              <w:top w:val="single" w:color="D3D9E2" w:sz="4"/>
+              <w:left w:val="single" w:color="D3D9E2" w:sz="4"/>
+              <w:bottom w:val="single" w:color="D3D9E2" w:sz="4"/>
+              <w:right w:val="single" w:color="D3D9E2" w:sz="4"/>
+            </w:tcBorders>
+            <w:shd w:fill="14284B" w:color="auto" w:val="clear"/>
+            <w:tcMar>
+              <w:top w:type="dxa" w:w="50"/>
+              <w:left w:type="dxa" w:w="80"/>
+              <w:bottom w:type="dxa" w:w="50"/>
+              <w:right w:type="dxa" w:w="80"/>
+            </w:tcMar>
+          </w:tcPr>
+          <w:p>
+            <w:pPr>
+              <w:jc w:val="left"/>
+            </w:pPr>
+            <w:r>
+              <w:rPr>
+                <w:b/>
+                <w:bCs/>
+                <w:color w:val="FFFFFF"/>
+                <w:sz w:val="16"/>
+                <w:szCs w:val="16"/>
+              </w:rPr>
+              <w:t xml:space="preserve">Sections of this report</w:t>
+            </w:r>
+          </w:p>
+        </w:tc>
+      </w:tr>
+      <w:tr>
+        <w:trPr>
+          <w:cantSplit/>
+        </w:trPr>
+        <w:tc>
+          <w:tcPr>
+            <w:tcW w:type="dxa" w:w="1900"/>
+            <w:tcBorders>
+              <w:top w:val="single" w:color="D3D9E2" w:sz="4"/>
+              <w:left w:val="single" w:color="D3D9E2" w:sz="4"/>
+              <w:bottom w:val="single" w:color="D3D9E2" w:sz="4"/>
+              <w:right w:val="single" w:color="D3D9E2" w:sz="4"/>
+            </w:tcBorders>
+            <w:shd w:fill="FFFFFF" w:color="auto" w:val="clear"/>
+            <w:tcMar>
+              <w:top w:type="dxa" w:w="50"/>
+              <w:left w:type="dxa" w:w="80"/>
+              <w:bottom w:type="dxa" w:w="50"/>
+              <w:right w:type="dxa" w:w="80"/>
+            </w:tcMar>
+          </w:tcPr>
+          <w:p>
+            <w:pPr>
+              <w:jc w:val="left"/>
+            </w:pPr>
+            <w:r>
+              <w:rPr>
+                <w:b/>
+                <w:bCs/>
+                <w:color w:val="1F2A3C"/>
+                <w:sz w:val="16"/>
+                <w:szCs w:val="16"/>
+              </w:rPr>
+              <w:t xml:space="preserve">N. Varshitha</w:t>
+            </w:r>
+          </w:p>
+        </w:tc>
+        <w:tc>
+          <w:tcPr>
+            <w:tcW w:type="dxa" w:w="3907"/>
+            <w:tcBorders>
+              <w:top w:val="single" w:color="D3D9E2" w:sz="4"/>
+              <w:left w:val="single" w:color="D3D9E2" w:sz="4"/>
+              <w:bottom w:val="single" w:color="D3D9E2" w:sz="4"/>
+              <w:right w:val="single" w:color="D3D9E2" w:sz="4"/>
+            </w:tcBorders>
+            <w:shd w:fill="FFFFFF" w:color="auto" w:val="clear"/>
+            <w:tcMar>
+              <w:top w:type="dxa" w:w="50"/>
+              <w:left w:type="dxa" w:w="80"/>
+              <w:bottom w:type="dxa" w:w="50"/>
+              <w:right w:type="dxa" w:w="80"/>
+            </w:tcMar>
+          </w:tcPr>
+          <w:p>
+            <w:pPr>
+              <w:jc w:val="left"/>
+            </w:pPr>
+            <w:r>
+              <w:rPr>
+                <w:b w:val="false"/>
+                <w:bCs w:val="false"/>
+                <w:color w:val="1F2A3C"/>
+                <w:sz w:val="16"/>
+                <w:szCs w:val="16"/>
+              </w:rPr>
+              <w:t xml:space="preserve">PS1 Data quality &amp; reliability · PS2 Fraud lens &amp; accuracy trap</w:t>
+            </w:r>
+          </w:p>
+        </w:tc>
+        <w:tc>
+          <w:tcPr>
+            <w:tcW w:type="dxa" w:w="3507"/>
+            <w:tcBorders>
+              <w:top w:val="single" w:color="D3D9E2" w:sz="4"/>
+              <w:left w:val="single" w:color="D3D9E2" w:sz="4"/>
+              <w:bottom w:val="single" w:color="D3D9E2" w:sz="4"/>
+              <w:right w:val="single" w:color="D3D9E2" w:sz="4"/>
+            </w:tcBorders>
+            <w:shd w:fill="FFFFFF" w:color="auto" w:val="clear"/>
+            <w:tcMar>
+              <w:top w:type="dxa" w:w="50"/>
+              <w:left w:type="dxa" w:w="80"/>
+              <w:bottom w:type="dxa" w:w="50"/>
+              <w:right w:type="dxa" w:w="80"/>
+            </w:tcMar>
+          </w:tcPr>
+          <w:p>
+            <w:pPr>
+              <w:jc w:val="left"/>
+            </w:pPr>
+            <w:r>
+              <w:rPr>
+                <w:b w:val="false"/>
+                <w:bCs w:val="false"/>
+                <w:color w:val="1F2A3C"/>
+                <w:sz w:val="16"/>
+                <w:szCs w:val="16"/>
+              </w:rPr>
+              <w:t xml:space="preserve">§2 Datasets · §3 Cleaning · §4 Accuracy trap</w:t>
+            </w:r>
+          </w:p>
+        </w:tc>
+      </w:tr>
+      <w:tr>
+        <w:trPr>
+          <w:cantSplit/>
+        </w:trPr>
+        <w:tc>
+          <w:tcPr>
+            <w:tcW w:type="dxa" w:w="1900"/>
+            <w:tcBorders>
+              <w:top w:val="single" w:color="D3D9E2" w:sz="4"/>
+              <w:left w:val="single" w:color="D3D9E2" w:sz="4"/>
+              <w:bottom w:val="single" w:color="D3D9E2" w:sz="4"/>
+              <w:right w:val="single" w:color="D3D9E2" w:sz="4"/>
+            </w:tcBorders>
+            <w:shd w:fill="FFFFFF" w:color="auto" w:val="clear"/>
+            <w:tcMar>
+              <w:top w:type="dxa" w:w="50"/>
+              <w:left w:type="dxa" w:w="80"/>
+              <w:bottom w:type="dxa" w:w="50"/>
+              <w:right w:type="dxa" w:w="80"/>
+            </w:tcMar>
+          </w:tcPr>
+          <w:p>
+            <w:pPr>
+              <w:jc w:val="left"/>
+            </w:pPr>
+            <w:r>
+              <w:rPr>
+                <w:b/>
+                <w:bCs/>
+                <w:color w:val="1F2A3C"/>
+                <w:sz w:val="16"/>
+                <w:szCs w:val="16"/>
+              </w:rPr>
+              <w:t xml:space="preserve">M. Kumara Swamy</w:t>
+            </w:r>
+          </w:p>
+        </w:tc>
+        <w:tc>
+          <w:tcPr>
+            <w:tcW w:type="dxa" w:w="3907"/>
+            <w:tcBorders>
+              <w:top w:val="single" w:color="D3D9E2" w:sz="4"/>
+              <w:left w:val="single" w:color="D3D9E2" w:sz="4"/>
+              <w:bottom w:val="single" w:color="D3D9E2" w:sz="4"/>
+              <w:right w:val="single" w:color="D3D9E2" w:sz="4"/>
+            </w:tcBorders>
+            <w:shd w:fill="FFFFFF" w:color="auto" w:val="clear"/>
+            <w:tcMar>
+              <w:top w:type="dxa" w:w="50"/>
+              <w:left w:type="dxa" w:w="80"/>
+              <w:bottom w:type="dxa" w:w="50"/>
+              <w:right w:type="dxa" w:w="80"/>
+            </w:tcMar>
+          </w:tcPr>
+          <w:p>
+            <w:pPr>
+              <w:jc w:val="left"/>
+            </w:pPr>
+            <w:r>
+              <w:rPr>
+                <w:b w:val="false"/>
+                <w:bCs w:val="false"/>
+                <w:color w:val="1F2A3C"/>
+                <w:sz w:val="16"/>
+                <w:szCs w:val="16"/>
+              </w:rPr>
+              <w:t xml:space="preserve">PS3 Fraud patterns (EDA) · PS4 Supervised learning</w:t>
+            </w:r>
+          </w:p>
+        </w:tc>
+        <w:tc>
+          <w:tcPr>
+            <w:tcW w:type="dxa" w:w="3507"/>
+            <w:tcBorders>
+              <w:top w:val="single" w:color="D3D9E2" w:sz="4"/>
+              <w:left w:val="single" w:color="D3D9E2" w:sz="4"/>
+              <w:bottom w:val="single" w:color="D3D9E2" w:sz="4"/>
+              <w:right w:val="single" w:color="D3D9E2" w:sz="4"/>
+            </w:tcBorders>
+            <w:shd w:fill="FFFFFF" w:color="auto" w:val="clear"/>
+            <w:tcMar>
+              <w:top w:type="dxa" w:w="50"/>
+              <w:left w:type="dxa" w:w="80"/>
+              <w:bottom w:type="dxa" w:w="50"/>
+              <w:right w:type="dxa" w:w="80"/>
+            </w:tcMar>
+          </w:tcPr>
+          <w:p>
+            <w:pPr>
+              <w:jc w:val="left"/>
+            </w:pPr>
+            <w:r>
+              <w:rPr>
+                <w:b w:val="false"/>
+                <w:bCs w:val="false"/>
+                <w:color w:val="1F2A3C"/>
+                <w:sz w:val="16"/>
+                <w:szCs w:val="16"/>
+              </w:rPr>
+              <w:t xml:space="preserve">§5 Where fraud lives · §6 What we built</w:t>
+            </w:r>
+          </w:p>
+        </w:tc>
+      </w:tr>
+      <w:tr>
+        <w:trPr>
+          <w:cantSplit/>
+        </w:trPr>
+        <w:tc>
+          <w:tcPr>
+            <w:tcW w:type="dxa" w:w="1900"/>
+            <w:tcBorders>
+              <w:top w:val="single" w:color="D3D9E2" w:sz="4"/>
+              <w:left w:val="single" w:color="D3D9E2" w:sz="4"/>
+              <w:bottom w:val="single" w:color="D3D9E2" w:sz="4"/>
+              <w:right w:val="single" w:color="D3D9E2" w:sz="4"/>
+            </w:tcBorders>
+            <w:shd w:fill="FFFFFF" w:color="auto" w:val="clear"/>
+            <w:tcMar>
+              <w:top w:type="dxa" w:w="50"/>
+              <w:left w:type="dxa" w:w="80"/>
+              <w:bottom w:type="dxa" w:w="50"/>
+              <w:right w:type="dxa" w:w="80"/>
+            </w:tcMar>
+          </w:tcPr>
+          <w:p>
+            <w:pPr>
+              <w:jc w:val="left"/>
+            </w:pPr>
+            <w:r>
+              <w:rPr>
+                <w:b/>
+                <w:bCs/>
+                <w:color w:val="1F2A3C"/>
+                <w:sz w:val="16"/>
+                <w:szCs w:val="16"/>
+              </w:rPr>
+              <w:t xml:space="preserve">V. Naishadh</w:t>
+            </w:r>
+          </w:p>
+        </w:tc>
+        <w:tc>
+          <w:tcPr>
+            <w:tcW w:type="dxa" w:w="3907"/>
+            <w:tcBorders>
+              <w:top w:val="single" w:color="D3D9E2" w:sz="4"/>
+              <w:left w:val="single" w:color="D3D9E2" w:sz="4"/>
+              <w:bottom w:val="single" w:color="D3D9E2" w:sz="4"/>
+              <w:right w:val="single" w:color="D3D9E2" w:sz="4"/>
+            </w:tcBorders>
+            <w:shd w:fill="FFFFFF" w:color="auto" w:val="clear"/>
+            <w:tcMar>
+              <w:top w:type="dxa" w:w="50"/>
+              <w:left w:type="dxa" w:w="80"/>
+              <w:bottom w:type="dxa" w:w="50"/>
+              <w:right w:type="dxa" w:w="80"/>
+            </w:tcMar>
+          </w:tcPr>
+          <w:p>
+            <w:pPr>
+              <w:jc w:val="left"/>
+            </w:pPr>
+            <w:r>
+              <w:rPr>
+                <w:b w:val="false"/>
+                <w:bCs w:val="false"/>
+                <w:color w:val="1F2A3C"/>
+                <w:sz w:val="16"/>
+                <w:szCs w:val="16"/>
+              </w:rPr>
+              <w:t xml:space="preserve">PS5 Anomaly detection · PS6 Cost-based threshold</w:t>
+            </w:r>
+          </w:p>
+        </w:tc>
+        <w:tc>
+          <w:tcPr>
+            <w:tcW w:type="dxa" w:w="3507"/>
+            <w:tcBorders>
+              <w:top w:val="single" w:color="D3D9E2" w:sz="4"/>
+              <w:left w:val="single" w:color="D3D9E2" w:sz="4"/>
+              <w:bottom w:val="single" w:color="D3D9E2" w:sz="4"/>
+              <w:right w:val="single" w:color="D3D9E2" w:sz="4"/>
+            </w:tcBorders>
+            <w:shd w:fill="FFFFFF" w:color="auto" w:val="clear"/>
+            <w:tcMar>
+              <w:top w:type="dxa" w:w="50"/>
+              <w:left w:type="dxa" w:w="80"/>
+              <w:bottom w:type="dxa" w:w="50"/>
+              <w:right w:type="dxa" w:w="80"/>
+            </w:tcMar>
+          </w:tcPr>
+          <w:p>
+            <w:pPr>
+              <w:jc w:val="left"/>
+            </w:pPr>
+            <w:r>
+              <w:rPr>
+                <w:b w:val="false"/>
+                <w:bCs w:val="false"/>
+                <w:color w:val="1F2A3C"/>
+                <w:sz w:val="16"/>
+                <w:szCs w:val="16"/>
+              </w:rPr>
+              <w:t xml:space="preserve">§6 Label-free detectors · §7 Threshold and cost</w:t>
+            </w:r>
+          </w:p>
+        </w:tc>
+      </w:tr>
+      <w:tr>
+        <w:trPr>
+          <w:cantSplit/>
+        </w:trPr>
+        <w:tc>
+          <w:tcPr>
+            <w:tcW w:type="dxa" w:w="1900"/>
+            <w:tcBorders>
+              <w:top w:val="single" w:color="D3D9E2" w:sz="4"/>
+              <w:left w:val="single" w:color="D3D9E2" w:sz="4"/>
+              <w:bottom w:val="single" w:color="D3D9E2" w:sz="4"/>
+              <w:right w:val="single" w:color="D3D9E2" w:sz="4"/>
+            </w:tcBorders>
+            <w:shd w:fill="FFFFFF" w:color="auto" w:val="clear"/>
+            <w:tcMar>
+              <w:top w:type="dxa" w:w="50"/>
+              <w:left w:type="dxa" w:w="80"/>
+              <w:bottom w:type="dxa" w:w="50"/>
+              <w:right w:type="dxa" w:w="80"/>
+            </w:tcMar>
+          </w:tcPr>
+          <w:p>
+            <w:pPr>
+              <w:jc w:val="left"/>
+            </w:pPr>
+            <w:r>
+              <w:rPr>
+                <w:b/>
+                <w:bCs/>
+                <w:color w:val="1F2A3C"/>
+                <w:sz w:val="16"/>
+                <w:szCs w:val="16"/>
+              </w:rPr>
+              <w:t xml:space="preserve">M. Suman Srinivas</w:t>
+            </w:r>
+          </w:p>
+        </w:tc>
+        <w:tc>
+          <w:tcPr>
+            <w:tcW w:type="dxa" w:w="3907"/>
+            <w:tcBorders>
+              <w:top w:val="single" w:color="D3D9E2" w:sz="4"/>
+              <w:left w:val="single" w:color="D3D9E2" w:sz="4"/>
+              <w:bottom w:val="single" w:color="D3D9E2" w:sz="4"/>
+              <w:right w:val="single" w:color="D3D9E2" w:sz="4"/>
+            </w:tcBorders>
+            <w:shd w:fill="FFFFFF" w:color="auto" w:val="clear"/>
+            <w:tcMar>
+              <w:top w:type="dxa" w:w="50"/>
+              <w:left w:type="dxa" w:w="80"/>
+              <w:bottom w:type="dxa" w:w="50"/>
+              <w:right w:type="dxa" w:w="80"/>
+            </w:tcMar>
+          </w:tcPr>
+          <w:p>
+            <w:pPr>
+              <w:jc w:val="left"/>
+            </w:pPr>
+            <w:r>
+              <w:rPr>
+                <w:b w:val="false"/>
+                <w:bCs w:val="false"/>
+                <w:color w:val="1F2A3C"/>
+                <w:sz w:val="16"/>
+                <w:szCs w:val="16"/>
+              </w:rPr>
+              <w:t xml:space="preserve">PS7 Risk-score rule · PS8 Selection, explanation &amp; actions</w:t>
+            </w:r>
+          </w:p>
+        </w:tc>
+        <w:tc>
+          <w:tcPr>
+            <w:tcW w:type="dxa" w:w="3507"/>
+            <w:tcBorders>
+              <w:top w:val="single" w:color="D3D9E2" w:sz="4"/>
+              <w:left w:val="single" w:color="D3D9E2" w:sz="4"/>
+              <w:bottom w:val="single" w:color="D3D9E2" w:sz="4"/>
+              <w:right w:val="single" w:color="D3D9E2" w:sz="4"/>
+            </w:tcBorders>
+            <w:shd w:fill="FFFFFF" w:color="auto" w:val="clear"/>
+            <w:tcMar>
+              <w:top w:type="dxa" w:w="50"/>
+              <w:left w:type="dxa" w:w="80"/>
+              <w:bottom w:type="dxa" w:w="50"/>
+              <w:right w:type="dxa" w:w="80"/>
+            </w:tcMar>
+          </w:tcPr>
+          <w:p>
+            <w:pPr>
+              <w:jc w:val="left"/>
+            </w:pPr>
+            <w:r>
+              <w:rPr>
+                <w:b w:val="false"/>
+                <w:bCs w:val="false"/>
+                <w:color w:val="1F2A3C"/>
+                <w:sz w:val="16"/>
+                <w:szCs w:val="16"/>
+              </w:rPr>
+              <w:t xml:space="preserve">§7 Decision rule · §8 Explanation · §9 Actions</w:t>
+            </w:r>
+          </w:p>
+        </w:tc>
+      </w:tr>
+    </w:tbl>
+    <w:p>
+      <w:pPr>
+        <w:spacing w:after="200"/>
+        <w:jc w:val="left"/>
+      </w:pPr>
+      <w:r>
+        <w:rPr>
+          <w:i/>
+          <w:iCs/>
+          <w:color w:val="5B677A"/>
+          <w:sz w:val="18"/>
+          <w:szCs w:val="18"/>
+        </w:rPr>
+        <w:t xml:space="preserve">Group 8 · Matrix Mechanics. Each member owns two problem statements end to end in the notebook, the documents and the presentation.</w:t>
+      </w:r>
+    </w:p>
     <w:sectPr>
       <w:footerReference w:type="default" r:id="rId6"/>
       <w:pgSz w:w="11906" w:h="16838" w:orient="portrait"/>
@@ -4972,7 +5623,7 @@
         <w:sz w:val="16"/>
         <w:szCs w:val="16"/>
       </w:rPr>
-      <w:t xml:space="preserve">FraudGuard · Business Report · page </w:t>
+      <w:t xml:space="preserve">FraudGuard · Group 8 · Matrix Mechanics · Business Report · page </w:t>
     </w:r>
     <w:r>
       <w:rPr>

</xml_diff>